<commit_message>
Software requirements specification, and seven more UAT scenarios
srs/srs.md follows the structure of github.com/jam01/SRS-Template: 79 requirements, each with an ID, a
statement, a rationale, acceptance criteria and a verification method, generated from the state model and
the working papers by srs/build_srs.py. Seven scenarios added for the riskiest untested moves (54 in all);
46 of the 63 moves in the transition table now have a UAT scenario.

Co-Authored-By: Claude Opus 5.5 <noreply@anthropic.com>
</commit_message>
<xml_diff>
--- a/docs/case-study-report.docx
+++ b/docs/case-study-report.docx
@@ -3571,7 +3571,7 @@
           <w:b w:val="0"/>
           <w:color w:val="16232B"/>
         </w:rPr>
-        <w:t xml:space="preserve"> is generated from the stories: 47 rows, each carrying its document, its refused move, its map steps and its decisions. The traceability matrix (W8) goes one step up, tying every test to a business objective.</w:t>
+        <w:t xml:space="preserve"> is generated from the stories: 54 rows, each carrying its document, its refused move, its map steps and its decisions. The traceability matrix (W8) goes one step up, tying every test to a business objective.</w:t>
       </w:r>
     </w:p>
     <w:p>
@@ -5311,7 +5311,7 @@
                 <w:color w:val="16232B"/>
                 <w:sz w:val="17"/>
               </w:rPr>
-              <w:t>Eight user stories, 47 Gherkin scenarios</w:t>
+              <w:t>Eight user stories, 54 Gherkin scenarios</w:t>
             </w:r>
           </w:p>
         </w:tc>

</xml_diff>